<commit_message>
doc: updated requirements documents
</commit_message>
<xml_diff>
--- a/docs/requirements/Functional_Requirements_V1.0.docx
+++ b/docs/requirements/Functional_Requirements_V1.0.docx
@@ -161,37 +161,7 @@
           </w:tcPr>
           <w:p>
             <w:r>
-              <w:t xml:space="preserve">The system </w:t>
-            </w:r>
-            <w:r>
-              <w:rPr>
-                <w:b/>
-                <w:bCs/>
-              </w:rPr>
-              <w:t>shall</w:t>
-            </w:r>
-            <w:r>
-              <w:t xml:space="preserve"> provide secure, role-based login portals for </w:t>
-            </w:r>
-            <w:r>
-              <w:rPr>
-                <w:b/>
-                <w:bCs/>
-              </w:rPr>
-              <w:t>Airline Staff</w:t>
-            </w:r>
-            <w:r>
-              <w:t xml:space="preserve"> (Admin/Verification) and </w:t>
-            </w:r>
-            <w:r>
-              <w:rPr>
-                <w:b/>
-                <w:bCs/>
-              </w:rPr>
-              <w:t>Passengers</w:t>
-            </w:r>
-            <w:r>
-              <w:t xml:space="preserve"> (Self-Service).</w:t>
+              <w:t>The system shall provide secure, role-based login portals for Airline Staff (Admin/Verification) and Passengers (Self-Service).</w:t>
             </w:r>
           </w:p>
         </w:tc>
@@ -258,24 +228,10 @@
           </w:tcPr>
           <w:p>
             <w:r>
-              <w:t xml:space="preserve">The system </w:t>
-            </w:r>
-            <w:r>
-              <w:rPr>
-                <w:b/>
-                <w:bCs/>
-              </w:rPr>
-              <w:t>shall</w:t>
-            </w:r>
-            <w:r>
-              <w:t xml:space="preserve"> support a two-tier model: </w:t>
+              <w:t xml:space="preserve">The system shall support a two-tier model: </w:t>
             </w:r>
             <w:proofErr w:type="spellStart"/>
             <w:r>
-              <w:rPr>
-                <w:b/>
-                <w:bCs/>
-              </w:rPr>
               <w:t>FlyDreamBlue</w:t>
             </w:r>
             <w:proofErr w:type="spellEnd"/>
@@ -284,10 +240,6 @@
             </w:r>
             <w:proofErr w:type="spellStart"/>
             <w:r>
-              <w:rPr>
-                <w:b/>
-                <w:bCs/>
-              </w:rPr>
               <w:t>FlyDreamGold</w:t>
             </w:r>
             <w:proofErr w:type="spellEnd"/>
@@ -359,17 +311,7 @@
           </w:tcPr>
           <w:p>
             <w:r>
-              <w:t xml:space="preserve">The system </w:t>
-            </w:r>
-            <w:r>
-              <w:rPr>
-                <w:b/>
-                <w:bCs/>
-              </w:rPr>
-              <w:t>must</w:t>
-            </w:r>
-            <w:r>
-              <w:t xml:space="preserve"> validate that a passenger’s account age is </w:t>
+              <w:t xml:space="preserve">The system must validate that a passenger’s account age is </w:t>
             </w:r>
             <w:r>
               <w:t>less than or greater than</w:t>
@@ -442,27 +384,7 @@
           </w:tcPr>
           <w:p>
             <w:r>
-              <w:t xml:space="preserve">Passengers </w:t>
-            </w:r>
-            <w:r>
-              <w:rPr>
-                <w:b/>
-                <w:bCs/>
-              </w:rPr>
-              <w:t>shall</w:t>
-            </w:r>
-            <w:r>
-              <w:t xml:space="preserve"> be able to create and cancel bookings for SYD and MEL lounges within a </w:t>
-            </w:r>
-            <w:r>
-              <w:rPr>
-                <w:b/>
-                <w:bCs/>
-              </w:rPr>
-              <w:t>7-day</w:t>
-            </w:r>
-            <w:r>
-              <w:t xml:space="preserve"> lead time.</w:t>
+              <w:t>Passengers shall be able to create and cancel bookings for SYD and MEL lounges within a 7-day lead time.</w:t>
             </w:r>
           </w:p>
         </w:tc>
@@ -529,17 +451,7 @@
           </w:tcPr>
           <w:p>
             <w:r>
-              <w:t xml:space="preserve">The system </w:t>
-            </w:r>
-            <w:r>
-              <w:rPr>
-                <w:b/>
-                <w:bCs/>
-              </w:rPr>
-              <w:t>shall</w:t>
-            </w:r>
-            <w:r>
-              <w:t xml:space="preserve"> track real-time capacity, </w:t>
+              <w:t xml:space="preserve">The system shall track real-time capacity, </w:t>
             </w:r>
             <w:proofErr w:type="gramStart"/>
             <w:r>
@@ -547,17 +459,7 @@
             </w:r>
             <w:proofErr w:type="gramEnd"/>
             <w:r>
-              <w:t xml:space="preserve"> </w:t>
-            </w:r>
-            <w:r>
-              <w:rPr>
-                <w:b/>
-                <w:bCs/>
-              </w:rPr>
-              <w:t>VIP Overrides</w:t>
-            </w:r>
-            <w:r>
-              <w:t xml:space="preserve"> while restricting </w:t>
+              <w:t xml:space="preserve"> VIP Overrides while restricting </w:t>
             </w:r>
             <w:proofErr w:type="gramStart"/>
             <w:r>
@@ -632,27 +534,7 @@
           </w:tcPr>
           <w:p>
             <w:r>
-              <w:t xml:space="preserve">The system </w:t>
-            </w:r>
-            <w:r>
-              <w:rPr>
-                <w:b/>
-                <w:bCs/>
-              </w:rPr>
-              <w:t>shall</w:t>
-            </w:r>
-            <w:r>
-              <w:t xml:space="preserve"> facilitate a fixed </w:t>
-            </w:r>
-            <w:r>
-              <w:rPr>
-                <w:b/>
-                <w:bCs/>
-              </w:rPr>
-              <w:t>AU$65.00</w:t>
-            </w:r>
-            <w:r>
-              <w:t xml:space="preserve"> fee for pay-per-use access via the Stripe API.</w:t>
+              <w:t>The system shall facilitate a fixed AU$65.00 fee for pay-per-use access via the Stripe API.</w:t>
             </w:r>
           </w:p>
         </w:tc>
@@ -719,17 +601,7 @@
           </w:tcPr>
           <w:p>
             <w:r>
-              <w:t xml:space="preserve">The system </w:t>
-            </w:r>
-            <w:r>
-              <w:rPr>
-                <w:b/>
-                <w:bCs/>
-              </w:rPr>
-              <w:t>shall</w:t>
-            </w:r>
-            <w:r>
-              <w:t xml:space="preserve"> generate a unique, scannable QR code for every valid booking to be used for staff-side entry validation.</w:t>
+              <w:t>The system shall generate a unique, scannable QR code for every valid booking to be used for staff-side entry validation.</w:t>
             </w:r>
           </w:p>
         </w:tc>
@@ -796,27 +668,7 @@
           </w:tcPr>
           <w:p>
             <w:r>
-              <w:t xml:space="preserve">The prototype </w:t>
-            </w:r>
-            <w:r>
-              <w:rPr>
-                <w:b/>
-                <w:bCs/>
-              </w:rPr>
-              <w:t>shall</w:t>
-            </w:r>
-            <w:r>
-              <w:t xml:space="preserve"> utilize a localized database populated with </w:t>
-            </w:r>
-            <w:r>
-              <w:rPr>
-                <w:b/>
-                <w:bCs/>
-              </w:rPr>
-              <w:t>synthetic sample data</w:t>
-            </w:r>
-            <w:r>
-              <w:t xml:space="preserve"> for passengers, staff, and flight records.</w:t>
+              <w:t>The prototype shall utilize a localized database populated with synthetic sample data for passengers, staff, and flight records.</w:t>
             </w:r>
           </w:p>
         </w:tc>

</xml_diff>